<commit_message>
feat(curriculum): refresh prerequisite practice sheets and keys for 53 lesson folders
Replace the Word/PDF prerequisite practice sheets and answer keys served from the Curriculum Hub with the current Reveal Math by Unit and Lesson versions: each sheet fits two pages, the Check Yourself row is one line, short answer blanks are longer, and guided Plot/Graph problems in 7.2-7.5, 7.7, 8.5 and 9.2 carry a blank number line or grid. Only the 540 prerequisite files and their byte/sha entries in data/reveal-document-downloads.json change; placement, URLs and teacher-only access are unchanged.

Claude-Session: https://claude.ai/code/session_019q9Zh3V76LQ2BJMD71La4K
</commit_message>
<xml_diff>
--- a/lessons/2-1/downloads/reveal/teacher/2.1-prerequisite-practice-answer-key.docx
+++ b/lessons/2-1/downloads/reveal/teacher/2.1-prerequisite-practice-answer-key.docx
@@ -13,7 +13,7 @@
           <w:caps/>
           <w:color w:val="003A70"/>
           <w:spacing w:val="12"/>
-          <w:sz w:val="19"/>
+          <w:sz w:val="22"/>
           <w:szCs w:val="19"/>
         </w:rPr>
         <w:t xml:space="preserve">Lesson 2-1  ·  Prerequisite Practice  ·  Answer Key</w:t>
@@ -21,6 +21,7 @@
     </w:p>
     <w:p>
       <w:pPr>
+        <w:pStyle w:val="Heading1"/>
         <w:spacing w:before="0" w:after="10" w:line="240" w:lineRule="auto"/>
       </w:pPr>
       <w:r>
@@ -45,7 +46,7 @@
         <w:rPr>
           <w:rFonts w:ascii="Avenir Next" w:hAnsi="Avenir Next" w:cs="Avenir Next" w:eastAsia="Avenir Next"/>
           <w:color w:val="5A5F66"/>
-          <w:sz w:val="17"/>
+          <w:sz w:val="22"/>
           <w:szCs w:val="17"/>
         </w:rPr>
         <w:t xml:space="preserve">Teacher use. Each sheet practices two earlier skills the session depends on. Step-frame answers are shown in order.</w:t>
@@ -85,6 +86,7 @@
           </w:tcPr>
           <w:p>
             <w:pPr>
+              <w:pStyle w:val="Heading2"/>
               <w:keepNext/>
               <w:pBdr>
                 <w:bottom w:val="single" w:sz="8" w:space="3" w:color="003A70"/>
@@ -100,7 +102,7 @@
                 <w:b/>
                 <w:color w:val="003A70"/>
                 <w:spacing w:val="14"/>
-                <w:sz w:val="19"/>
+                <w:sz w:val="22"/>
                 <w:szCs w:val="19"/>
               </w:rPr>
               <w:t xml:space="preserve">SESSION 1  ·  PRACTICE A</w:t>
@@ -119,7 +121,7 @@
                 <w:rFonts w:ascii="Avenir Next" w:hAnsi="Avenir Next" w:cs="Avenir Next" w:eastAsia="Avenir Next"/>
                 <w:i/>
                 <w:color w:val="5A5F66"/>
-                <w:sz w:val="17"/>
+                <w:sz w:val="22"/>
                 <w:szCs w:val="17"/>
               </w:rPr>
               <w:t xml:space="preserve">Know Fixed Measurement Facts · Find Least and Greatest</w:t>
@@ -138,7 +140,7 @@
                 <w:rFonts w:ascii="Avenir Next" w:hAnsi="Avenir Next" w:cs="Avenir Next" w:eastAsia="Avenir Next"/>
                 <w:b/>
                 <w:color w:val="1A1A1A"/>
-                <w:sz w:val="17"/>
+                <w:sz w:val="22"/>
                 <w:szCs w:val="17"/>
               </w:rPr>
               <w:t xml:space="preserve">1.</w:t>
@@ -156,7 +158,7 @@
               <w:rPr>
                 <w:rFonts w:ascii="Avenir Next" w:hAnsi="Avenir Next" w:cs="Avenir Next" w:eastAsia="Avenir Next"/>
                 <w:color w:val="1A1A1A"/>
-                <w:sz w:val="17"/>
+                <w:sz w:val="22"/>
                 <w:szCs w:val="17"/>
               </w:rPr>
               <w:t xml:space="preserve">Step 1: 24   Step 2: 72   Step 3: 72</w:t>
@@ -175,7 +177,7 @@
                 <w:rFonts w:ascii="Avenir Next" w:hAnsi="Avenir Next" w:cs="Avenir Next" w:eastAsia="Avenir Next"/>
                 <w:b/>
                 <w:color w:val="1A1A1A"/>
-                <w:sz w:val="17"/>
+                <w:sz w:val="22"/>
                 <w:szCs w:val="17"/>
               </w:rPr>
               <w:t xml:space="preserve">2.</w:t>
@@ -193,7 +195,7 @@
               <w:rPr>
                 <w:rFonts w:ascii="Avenir Next" w:hAnsi="Avenir Next" w:cs="Avenir Next" w:eastAsia="Avenir Next"/>
                 <w:color w:val="1A1A1A"/>
-                <w:sz w:val="17"/>
+                <w:sz w:val="22"/>
                 <w:szCs w:val="17"/>
               </w:rPr>
               <w:t xml:space="preserve">Step 1: 12   Step 2: 24   Step 3: 24</w:t>
@@ -212,7 +214,7 @@
                 <w:rFonts w:ascii="Avenir Next" w:hAnsi="Avenir Next" w:cs="Avenir Next" w:eastAsia="Avenir Next"/>
                 <w:b/>
                 <w:color w:val="1A1A1A"/>
-                <w:sz w:val="17"/>
+                <w:sz w:val="22"/>
                 <w:szCs w:val="17"/>
               </w:rPr>
               <w:t xml:space="preserve">3.</w:t>
@@ -230,7 +232,7 @@
               <w:rPr>
                 <w:rFonts w:ascii="Avenir Next" w:hAnsi="Avenir Next" w:cs="Avenir Next" w:eastAsia="Avenir Next"/>
                 <w:color w:val="1A1A1A"/>
-                <w:sz w:val="17"/>
+                <w:sz w:val="22"/>
                 <w:szCs w:val="17"/>
               </w:rPr>
               <w:t xml:space="preserve">a. 120  b. 60  c. 300  d. 28  e. 18  f. 48</w:t>
@@ -249,7 +251,7 @@
                 <w:rFonts w:ascii="Avenir Next" w:hAnsi="Avenir Next" w:cs="Avenir Next" w:eastAsia="Avenir Next"/>
                 <w:b/>
                 <w:color w:val="1A1A1A"/>
-                <w:sz w:val="17"/>
+                <w:sz w:val="22"/>
                 <w:szCs w:val="17"/>
               </w:rPr>
               <w:t xml:space="preserve">4.</w:t>
@@ -267,7 +269,7 @@
               <w:rPr>
                 <w:rFonts w:ascii="Avenir Next" w:hAnsi="Avenir Next" w:cs="Avenir Next" w:eastAsia="Avenir Next"/>
                 <w:color w:val="1A1A1A"/>
-                <w:sz w:val="17"/>
+                <w:sz w:val="22"/>
                 <w:szCs w:val="17"/>
               </w:rPr>
               <w:t xml:space="preserve">Step 1: 5   Step 2: 9   Step 3: 30</w:t>
@@ -286,7 +288,7 @@
                 <w:rFonts w:ascii="Avenir Next" w:hAnsi="Avenir Next" w:cs="Avenir Next" w:eastAsia="Avenir Next"/>
                 <w:b/>
                 <w:color w:val="1A1A1A"/>
-                <w:sz w:val="17"/>
+                <w:sz w:val="22"/>
                 <w:szCs w:val="17"/>
               </w:rPr>
               <w:t xml:space="preserve">5.</w:t>
@@ -304,7 +306,7 @@
               <w:rPr>
                 <w:rFonts w:ascii="Avenir Next" w:hAnsi="Avenir Next" w:cs="Avenir Next" w:eastAsia="Avenir Next"/>
                 <w:color w:val="1A1A1A"/>
-                <w:sz w:val="17"/>
+                <w:sz w:val="22"/>
                 <w:szCs w:val="17"/>
               </w:rPr>
               <w:t xml:space="preserve">Step 1: 5   Step 2: 5   Step 3: 55</w:t>
@@ -323,7 +325,7 @@
                 <w:rFonts w:ascii="Avenir Next" w:hAnsi="Avenir Next" w:cs="Avenir Next" w:eastAsia="Avenir Next"/>
                 <w:b/>
                 <w:color w:val="1A1A1A"/>
-                <w:sz w:val="17"/>
+                <w:sz w:val="22"/>
                 <w:szCs w:val="17"/>
               </w:rPr>
               <w:t xml:space="preserve">6.</w:t>
@@ -341,7 +343,7 @@
               <w:rPr>
                 <w:rFonts w:ascii="Avenir Next" w:hAnsi="Avenir Next" w:cs="Avenir Next" w:eastAsia="Avenir Next"/>
                 <w:color w:val="1A1A1A"/>
-                <w:sz w:val="17"/>
+                <w:sz w:val="22"/>
                 <w:szCs w:val="17"/>
               </w:rPr>
               <w:t xml:space="preserve">a. 0 and 9  b. 5 and 30  c. 3 and 10  d. 40 and 54  e. 8 and 14  f. 35 and 90</w:t>
@@ -360,7 +362,7 @@
                 <w:rFonts w:ascii="Avenir Next" w:hAnsi="Avenir Next" w:cs="Avenir Next" w:eastAsia="Avenir Next"/>
                 <w:b/>
                 <w:color w:val="1A1A1A"/>
-                <w:sz w:val="17"/>
+                <w:sz w:val="22"/>
                 <w:szCs w:val="17"/>
               </w:rPr>
               <w:t xml:space="preserve">7.</w:t>
@@ -379,7 +381,7 @@
                 <w:rFonts w:ascii="Avenir Next" w:hAnsi="Avenir Next" w:cs="Avenir Next" w:eastAsia="Avenir Next"/>
                 <w:b/>
                 <w:color w:val="1A1A1A"/>
-                <w:sz w:val="17"/>
+                <w:sz w:val="22"/>
                 <w:szCs w:val="17"/>
               </w:rPr>
               <w:t xml:space="preserve">C</w:t>
@@ -388,7 +390,7 @@
               <w:rPr>
                 <w:rFonts w:ascii="Avenir Next" w:hAnsi="Avenir Next" w:cs="Avenir Next" w:eastAsia="Avenir Next"/>
                 <w:color w:val="1A1A1A"/>
-                <w:sz w:val="17"/>
+                <w:sz w:val="22"/>
                 <w:szCs w:val="17"/>
               </w:rPr>
               <w:t xml:space="preserve">  (14)</w:t>
@@ -402,6 +404,7 @@
           </w:tcPr>
           <w:p>
             <w:pPr>
+              <w:pStyle w:val="Heading2"/>
               <w:keepNext/>
               <w:pBdr>
                 <w:bottom w:val="single" w:sz="8" w:space="3" w:color="003A70"/>
@@ -417,7 +420,7 @@
                 <w:b/>
                 <w:color w:val="003A70"/>
                 <w:spacing w:val="14"/>
-                <w:sz w:val="19"/>
+                <w:sz w:val="22"/>
                 <w:szCs w:val="19"/>
               </w:rPr>
               <w:t xml:space="preserve">SESSION 1  ·  PRACTICE B</w:t>
@@ -436,7 +439,7 @@
                 <w:rFonts w:ascii="Avenir Next" w:hAnsi="Avenir Next" w:cs="Avenir Next" w:eastAsia="Avenir Next"/>
                 <w:i/>
                 <w:color w:val="5A5F66"/>
-                <w:sz w:val="17"/>
+                <w:sz w:val="22"/>
                 <w:szCs w:val="17"/>
               </w:rPr>
               <w:t xml:space="preserve">Read Survey Results · Read a Line Plot</w:t>
@@ -455,7 +458,7 @@
                 <w:rFonts w:ascii="Avenir Next" w:hAnsi="Avenir Next" w:cs="Avenir Next" w:eastAsia="Avenir Next"/>
                 <w:b/>
                 <w:color w:val="1A1A1A"/>
-                <w:sz w:val="17"/>
+                <w:sz w:val="22"/>
                 <w:szCs w:val="17"/>
               </w:rPr>
               <w:t xml:space="preserve">1.</w:t>
@@ -473,7 +476,7 @@
               <w:rPr>
                 <w:rFonts w:ascii="Avenir Next" w:hAnsi="Avenir Next" w:cs="Avenir Next" w:eastAsia="Avenir Next"/>
                 <w:color w:val="1A1A1A"/>
-                <w:sz w:val="17"/>
+                <w:sz w:val="22"/>
                 <w:szCs w:val="17"/>
               </w:rPr>
               <w:t xml:space="preserve">Step 1: grape   Step 2: 8   Step 3: 15</w:t>
@@ -492,7 +495,7 @@
                 <w:rFonts w:ascii="Avenir Next" w:hAnsi="Avenir Next" w:cs="Avenir Next" w:eastAsia="Avenir Next"/>
                 <w:b/>
                 <w:color w:val="1A1A1A"/>
-                <w:sz w:val="17"/>
+                <w:sz w:val="22"/>
                 <w:szCs w:val="17"/>
               </w:rPr>
               <w:t xml:space="preserve">2.</w:t>
@@ -510,7 +513,7 @@
               <w:rPr>
                 <w:rFonts w:ascii="Avenir Next" w:hAnsi="Avenir Next" w:cs="Avenir Next" w:eastAsia="Avenir Next"/>
                 <w:color w:val="1A1A1A"/>
-                <w:sz w:val="17"/>
+                <w:sz w:val="22"/>
                 <w:szCs w:val="17"/>
               </w:rPr>
               <w:t xml:space="preserve">Step 1: green   Step 2: 4   Step 3: 7, 9, 4, 5, 25</w:t>
@@ -529,7 +532,7 @@
                 <w:rFonts w:ascii="Avenir Next" w:hAnsi="Avenir Next" w:cs="Avenir Next" w:eastAsia="Avenir Next"/>
                 <w:b/>
                 <w:color w:val="1A1A1A"/>
-                <w:sz w:val="17"/>
+                <w:sz w:val="22"/>
                 <w:szCs w:val="17"/>
               </w:rPr>
               <w:t xml:space="preserve">3.</w:t>
@@ -547,7 +550,7 @@
               <w:rPr>
                 <w:rFonts w:ascii="Avenir Next" w:hAnsi="Avenir Next" w:cs="Avenir Next" w:eastAsia="Avenir Next"/>
                 <w:color w:val="1A1A1A"/>
-                <w:sz w:val="17"/>
+                <w:sz w:val="22"/>
                 <w:szCs w:val="17"/>
               </w:rPr>
               <w:t xml:space="preserve">a. 6  b. 4  c. dog  d. rabbit  e. 15  f. 24</w:t>
@@ -566,7 +569,7 @@
                 <w:rFonts w:ascii="Avenir Next" w:hAnsi="Avenir Next" w:cs="Avenir Next" w:eastAsia="Avenir Next"/>
                 <w:b/>
                 <w:color w:val="1A1A1A"/>
-                <w:sz w:val="17"/>
+                <w:sz w:val="22"/>
                 <w:szCs w:val="17"/>
               </w:rPr>
               <w:t xml:space="preserve">4.</w:t>
@@ -584,7 +587,7 @@
               <w:rPr>
                 <w:rFonts w:ascii="Avenir Next" w:hAnsi="Avenir Next" w:cs="Avenir Next" w:eastAsia="Avenir Next"/>
                 <w:color w:val="1A1A1A"/>
-                <w:sz w:val="17"/>
+                <w:sz w:val="22"/>
                 <w:szCs w:val="17"/>
               </w:rPr>
               <w:t xml:space="preserve">Step 1: 8   Step 2: 4 and 4   Step 3: 7</w:t>
@@ -603,7 +606,7 @@
                 <w:rFonts w:ascii="Avenir Next" w:hAnsi="Avenir Next" w:cs="Avenir Next" w:eastAsia="Avenir Next"/>
                 <w:b/>
                 <w:color w:val="1A1A1A"/>
-                <w:sz w:val="17"/>
+                <w:sz w:val="22"/>
                 <w:szCs w:val="17"/>
               </w:rPr>
               <w:t xml:space="preserve">5.</w:t>
@@ -621,7 +624,7 @@
               <w:rPr>
                 <w:rFonts w:ascii="Avenir Next" w:hAnsi="Avenir Next" w:cs="Avenir Next" w:eastAsia="Avenir Next"/>
                 <w:color w:val="1A1A1A"/>
-                <w:sz w:val="17"/>
+                <w:sz w:val="22"/>
                 <w:szCs w:val="17"/>
               </w:rPr>
               <w:t xml:space="preserve">Step 1: number   Step 2: 2, 5, 1   Step 3: 8</w:t>
@@ -640,7 +643,7 @@
                 <w:rFonts w:ascii="Avenir Next" w:hAnsi="Avenir Next" w:cs="Avenir Next" w:eastAsia="Avenir Next"/>
                 <w:b/>
                 <w:color w:val="1A1A1A"/>
-                <w:sz w:val="17"/>
+                <w:sz w:val="22"/>
                 <w:szCs w:val="17"/>
               </w:rPr>
               <w:t xml:space="preserve">6.</w:t>
@@ -658,7 +661,7 @@
               <w:rPr>
                 <w:rFonts w:ascii="Avenir Next" w:hAnsi="Avenir Next" w:cs="Avenir Next" w:eastAsia="Avenir Next"/>
                 <w:color w:val="1A1A1A"/>
-                <w:sz w:val="17"/>
+                <w:sz w:val="22"/>
                 <w:szCs w:val="17"/>
               </w:rPr>
               <w:t xml:space="preserve">a. 2  b. 1  c. 7</w:t>
@@ -677,7 +680,7 @@
                 <w:rFonts w:ascii="Avenir Next" w:hAnsi="Avenir Next" w:cs="Avenir Next" w:eastAsia="Avenir Next"/>
                 <w:b/>
                 <w:color w:val="1A1A1A"/>
-                <w:sz w:val="17"/>
+                <w:sz w:val="22"/>
                 <w:szCs w:val="17"/>
               </w:rPr>
               <w:t xml:space="preserve">7.</w:t>
@@ -696,7 +699,7 @@
                 <w:rFonts w:ascii="Avenir Next" w:hAnsi="Avenir Next" w:cs="Avenir Next" w:eastAsia="Avenir Next"/>
                 <w:b/>
                 <w:color w:val="1A1A1A"/>
-                <w:sz w:val="17"/>
+                <w:sz w:val="22"/>
                 <w:szCs w:val="17"/>
               </w:rPr>
               <w:t xml:space="preserve">B</w:t>
@@ -705,7 +708,7 @@
               <w:rPr>
                 <w:rFonts w:ascii="Avenir Next" w:hAnsi="Avenir Next" w:cs="Avenir Next" w:eastAsia="Avenir Next"/>
                 <w:color w:val="1A1A1A"/>
-                <w:sz w:val="17"/>
+                <w:sz w:val="22"/>
                 <w:szCs w:val="17"/>
               </w:rPr>
               <w:t xml:space="preserve">  (10)</w:t>
@@ -753,6 +756,7 @@
           </w:tcPr>
           <w:p>
             <w:pPr>
+              <w:pStyle w:val="Heading2"/>
               <w:keepNext/>
               <w:pBdr>
                 <w:bottom w:val="single" w:sz="8" w:space="3" w:color="003A70"/>
@@ -768,7 +772,7 @@
                 <w:b/>
                 <w:color w:val="003A70"/>
                 <w:spacing w:val="14"/>
-                <w:sz w:val="19"/>
+                <w:sz w:val="22"/>
                 <w:szCs w:val="19"/>
               </w:rPr>
               <w:t xml:space="preserve">SESSION 2  ·  PRACTICE A</w:t>
@@ -787,7 +791,7 @@
                 <w:rFonts w:ascii="Avenir Next" w:hAnsi="Avenir Next" w:cs="Avenir Next" w:eastAsia="Avenir Next"/>
                 <w:i/>
                 <w:color w:val="5A5F66"/>
-                <w:sz w:val="17"/>
+                <w:sz w:val="22"/>
                 <w:szCs w:val="17"/>
               </w:rPr>
               <w:t xml:space="preserve">Read a Scaled Number Line · Spot Line Symmetry</w:t>
@@ -806,7 +810,7 @@
                 <w:rFonts w:ascii="Avenir Next" w:hAnsi="Avenir Next" w:cs="Avenir Next" w:eastAsia="Avenir Next"/>
                 <w:b/>
                 <w:color w:val="1A1A1A"/>
-                <w:sz w:val="17"/>
+                <w:sz w:val="22"/>
                 <w:szCs w:val="17"/>
               </w:rPr>
               <w:t xml:space="preserve">1.</w:t>
@@ -824,7 +828,7 @@
               <w:rPr>
                 <w:rFonts w:ascii="Avenir Next" w:hAnsi="Avenir Next" w:cs="Avenir Next" w:eastAsia="Avenir Next"/>
                 <w:color w:val="1A1A1A"/>
-                <w:sz w:val="17"/>
+                <w:sz w:val="22"/>
                 <w:szCs w:val="17"/>
               </w:rPr>
               <w:t xml:space="preserve">Step 1: 50   Step 2: 5 and 10   Step 3: 30 and 30</w:t>
@@ -843,7 +847,7 @@
                 <w:rFonts w:ascii="Avenir Next" w:hAnsi="Avenir Next" w:cs="Avenir Next" w:eastAsia="Avenir Next"/>
                 <w:b/>
                 <w:color w:val="1A1A1A"/>
-                <w:sz w:val="17"/>
+                <w:sz w:val="22"/>
                 <w:szCs w:val="17"/>
               </w:rPr>
               <w:t xml:space="preserve">2.</w:t>
@@ -861,7 +865,7 @@
               <w:rPr>
                 <w:rFonts w:ascii="Avenir Next" w:hAnsi="Avenir Next" w:cs="Avenir Next" w:eastAsia="Avenir Next"/>
                 <w:color w:val="1A1A1A"/>
-                <w:sz w:val="17"/>
+                <w:sz w:val="22"/>
                 <w:szCs w:val="17"/>
               </w:rPr>
               <w:t xml:space="preserve">Step 1: 6   Step 2: 2   Step 3: 14 and 16</w:t>
@@ -880,7 +884,7 @@
                 <w:rFonts w:ascii="Avenir Next" w:hAnsi="Avenir Next" w:cs="Avenir Next" w:eastAsia="Avenir Next"/>
                 <w:b/>
                 <w:color w:val="1A1A1A"/>
-                <w:sz w:val="17"/>
+                <w:sz w:val="22"/>
                 <w:szCs w:val="17"/>
               </w:rPr>
               <w:t xml:space="preserve">3.</w:t>
@@ -898,7 +902,7 @@
               <w:rPr>
                 <w:rFonts w:ascii="Avenir Next" w:hAnsi="Avenir Next" w:cs="Avenir Next" w:eastAsia="Avenir Next"/>
                 <w:color w:val="1A1A1A"/>
-                <w:sz w:val="17"/>
+                <w:sz w:val="22"/>
                 <w:szCs w:val="17"/>
               </w:rPr>
               <w:t xml:space="preserve">a. 5  b. 5  c. 25  d. 2  e. 10  f. 10</w:t>
@@ -917,7 +921,7 @@
                 <w:rFonts w:ascii="Avenir Next" w:hAnsi="Avenir Next" w:cs="Avenir Next" w:eastAsia="Avenir Next"/>
                 <w:b/>
                 <w:color w:val="1A1A1A"/>
-                <w:sz w:val="17"/>
+                <w:sz w:val="22"/>
                 <w:szCs w:val="17"/>
               </w:rPr>
               <w:t xml:space="preserve">4.</w:t>
@@ -935,7 +939,7 @@
               <w:rPr>
                 <w:rFonts w:ascii="Avenir Next" w:hAnsi="Avenir Next" w:cs="Avenir Next" w:eastAsia="Avenir Next"/>
                 <w:color w:val="1A1A1A"/>
-                <w:sz w:val="17"/>
+                <w:sz w:val="22"/>
                 <w:szCs w:val="17"/>
               </w:rPr>
               <w:t xml:space="preserve">Step 1: 6   Step 2: 4, 4, 2, 2   Step 3: yes, symmetric</w:t>
@@ -954,7 +958,7 @@
                 <w:rFonts w:ascii="Avenir Next" w:hAnsi="Avenir Next" w:cs="Avenir Next" w:eastAsia="Avenir Next"/>
                 <w:b/>
                 <w:color w:val="1A1A1A"/>
-                <w:sz w:val="17"/>
+                <w:sz w:val="22"/>
                 <w:szCs w:val="17"/>
               </w:rPr>
               <w:t xml:space="preserve">5.</w:t>
@@ -972,7 +976,7 @@
               <w:rPr>
                 <w:rFonts w:ascii="Avenir Next" w:hAnsi="Avenir Next" w:cs="Avenir Next" w:eastAsia="Avenir Next"/>
                 <w:color w:val="1A1A1A"/>
-                <w:sz w:val="17"/>
+                <w:sz w:val="22"/>
                 <w:szCs w:val="17"/>
               </w:rPr>
               <w:t xml:space="preserve">Step 1: 5   Step 2: 3, 2, 1, 1   Step 3: no, not symmetric</w:t>
@@ -991,7 +995,7 @@
                 <w:rFonts w:ascii="Avenir Next" w:hAnsi="Avenir Next" w:cs="Avenir Next" w:eastAsia="Avenir Next"/>
                 <w:b/>
                 <w:color w:val="1A1A1A"/>
-                <w:sz w:val="17"/>
+                <w:sz w:val="22"/>
                 <w:szCs w:val="17"/>
               </w:rPr>
               <w:t xml:space="preserve">6.</w:t>
@@ -1009,7 +1013,7 @@
               <w:rPr>
                 <w:rFonts w:ascii="Avenir Next" w:hAnsi="Avenir Next" w:cs="Avenir Next" w:eastAsia="Avenir Next"/>
                 <w:color w:val="1A1A1A"/>
-                <w:sz w:val="17"/>
+                <w:sz w:val="22"/>
                 <w:szCs w:val="17"/>
               </w:rPr>
               <w:t xml:space="preserve">a. S  b. N  c. S  d. N  e. S  f. N</w:t>
@@ -1028,7 +1032,7 @@
                 <w:rFonts w:ascii="Avenir Next" w:hAnsi="Avenir Next" w:cs="Avenir Next" w:eastAsia="Avenir Next"/>
                 <w:b/>
                 <w:color w:val="1A1A1A"/>
-                <w:sz w:val="17"/>
+                <w:sz w:val="22"/>
                 <w:szCs w:val="17"/>
               </w:rPr>
               <w:t xml:space="preserve">7.</w:t>
@@ -1047,7 +1051,7 @@
                 <w:rFonts w:ascii="Avenir Next" w:hAnsi="Avenir Next" w:cs="Avenir Next" w:eastAsia="Avenir Next"/>
                 <w:b/>
                 <w:color w:val="1A1A1A"/>
-                <w:sz w:val="17"/>
+                <w:sz w:val="22"/>
                 <w:szCs w:val="17"/>
               </w:rPr>
               <w:t xml:space="preserve">B</w:t>
@@ -1056,7 +1060,7 @@
               <w:rPr>
                 <w:rFonts w:ascii="Avenir Next" w:hAnsi="Avenir Next" w:cs="Avenir Next" w:eastAsia="Avenir Next"/>
                 <w:color w:val="1A1A1A"/>
-                <w:sz w:val="17"/>
+                <w:sz w:val="22"/>
                 <w:szCs w:val="17"/>
               </w:rPr>
               <w:t xml:space="preserve">  (2, 5, 8, 5, 2)</w:t>
@@ -1070,6 +1074,7 @@
           </w:tcPr>
           <w:p>
             <w:pPr>
+              <w:pStyle w:val="Heading2"/>
               <w:keepNext/>
               <w:pBdr>
                 <w:bottom w:val="single" w:sz="8" w:space="3" w:color="003A70"/>
@@ -1085,7 +1090,7 @@
                 <w:b/>
                 <w:color w:val="003A70"/>
                 <w:spacing w:val="14"/>
-                <w:sz w:val="19"/>
+                <w:sz w:val="22"/>
                 <w:szCs w:val="19"/>
               </w:rPr>
               <w:t xml:space="preserve">SESSION 2  ·  PRACTICE B</w:t>
@@ -1104,7 +1109,7 @@
                 <w:rFonts w:ascii="Avenir Next" w:hAnsi="Avenir Next" w:cs="Avenir Next" w:eastAsia="Avenir Next"/>
                 <w:i/>
                 <w:color w:val="5A5F66"/>
-                <w:sz w:val="17"/>
+                <w:sz w:val="22"/>
                 <w:szCs w:val="17"/>
               </w:rPr>
               <w:t xml:space="preserve">Order Data With Repeats · Make a Frequency Table</w:t>
@@ -1123,7 +1128,7 @@
                 <w:rFonts w:ascii="Avenir Next" w:hAnsi="Avenir Next" w:cs="Avenir Next" w:eastAsia="Avenir Next"/>
                 <w:b/>
                 <w:color w:val="1A1A1A"/>
-                <w:sz w:val="17"/>
+                <w:sz w:val="22"/>
                 <w:szCs w:val="17"/>
               </w:rPr>
               <w:t xml:space="preserve">1.</w:t>
@@ -1141,7 +1146,7 @@
               <w:rPr>
                 <w:rFonts w:ascii="Avenir Next" w:hAnsi="Avenir Next" w:cs="Avenir Next" w:eastAsia="Avenir Next"/>
                 <w:color w:val="1A1A1A"/>
-                <w:sz w:val="17"/>
+                <w:sz w:val="22"/>
                 <w:szCs w:val="17"/>
               </w:rPr>
               <w:t xml:space="preserve">Step 1: 1 and 2   Step 2: 1   Step 3: 1, 1, 2, 3, 4</w:t>
@@ -1160,7 +1165,7 @@
                 <w:rFonts w:ascii="Avenir Next" w:hAnsi="Avenir Next" w:cs="Avenir Next" w:eastAsia="Avenir Next"/>
                 <w:b/>
                 <w:color w:val="1A1A1A"/>
-                <w:sz w:val="17"/>
+                <w:sz w:val="22"/>
                 <w:szCs w:val="17"/>
               </w:rPr>
               <w:t xml:space="preserve">2.</w:t>
@@ -1178,7 +1183,7 @@
               <w:rPr>
                 <w:rFonts w:ascii="Avenir Next" w:hAnsi="Avenir Next" w:cs="Avenir Next" w:eastAsia="Avenir Next"/>
                 <w:color w:val="1A1A1A"/>
-                <w:sz w:val="17"/>
+                <w:sz w:val="22"/>
                 <w:szCs w:val="17"/>
               </w:rPr>
               <w:t xml:space="preserve">Step 1: 6 and 3   Step 2: 6   Step 3: 6, 6, 6, 7, 8, 9</w:t>
@@ -1197,7 +1202,7 @@
                 <w:rFonts w:ascii="Avenir Next" w:hAnsi="Avenir Next" w:cs="Avenir Next" w:eastAsia="Avenir Next"/>
                 <w:b/>
                 <w:color w:val="1A1A1A"/>
-                <w:sz w:val="17"/>
+                <w:sz w:val="22"/>
                 <w:szCs w:val="17"/>
               </w:rPr>
               <w:t xml:space="preserve">3.</w:t>
@@ -1215,7 +1220,7 @@
               <w:rPr>
                 <w:rFonts w:ascii="Avenir Next" w:hAnsi="Avenir Next" w:cs="Avenir Next" w:eastAsia="Avenir Next"/>
                 <w:color w:val="1A1A1A"/>
-                <w:sz w:val="17"/>
+                <w:sz w:val="22"/>
                 <w:szCs w:val="17"/>
               </w:rPr>
               <w:t xml:space="preserve">a. 2, 2, 3, 4, 5  b. 7, 7, 8, 9, 9, 9  c. 0, 1, 1, 2, 3, 3, 3  d. 10, 10, 11, 12, 12, 12</w:t>
@@ -1234,7 +1239,7 @@
                 <w:rFonts w:ascii="Avenir Next" w:hAnsi="Avenir Next" w:cs="Avenir Next" w:eastAsia="Avenir Next"/>
                 <w:b/>
                 <w:color w:val="1A1A1A"/>
-                <w:sz w:val="17"/>
+                <w:sz w:val="22"/>
                 <w:szCs w:val="17"/>
               </w:rPr>
               <w:t xml:space="preserve">4.</w:t>
@@ -1252,7 +1257,7 @@
               <w:rPr>
                 <w:rFonts w:ascii="Avenir Next" w:hAnsi="Avenir Next" w:cs="Avenir Next" w:eastAsia="Avenir Next"/>
                 <w:color w:val="1A1A1A"/>
-                <w:sz w:val="17"/>
+                <w:sz w:val="22"/>
                 <w:szCs w:val="17"/>
               </w:rPr>
               <w:t xml:space="preserve">Step 1: 4, 5, 6   Step 2: 3, 1, 2   Step 3: 6</w:t>
@@ -1271,7 +1276,7 @@
                 <w:rFonts w:ascii="Avenir Next" w:hAnsi="Avenir Next" w:cs="Avenir Next" w:eastAsia="Avenir Next"/>
                 <w:b/>
                 <w:color w:val="1A1A1A"/>
-                <w:sz w:val="17"/>
+                <w:sz w:val="22"/>
                 <w:szCs w:val="17"/>
               </w:rPr>
               <w:t xml:space="preserve">5.</w:t>
@@ -1289,7 +1294,7 @@
               <w:rPr>
                 <w:rFonts w:ascii="Avenir Next" w:hAnsi="Avenir Next" w:cs="Avenir Next" w:eastAsia="Avenir Next"/>
                 <w:color w:val="1A1A1A"/>
-                <w:sz w:val="17"/>
+                <w:sz w:val="22"/>
                 <w:szCs w:val="17"/>
               </w:rPr>
               <w:t xml:space="preserve">Step 1: 1, 2, 3   Step 2: 2, 4, 1   Step 3: 7</w:t>
@@ -1308,7 +1313,7 @@
                 <w:rFonts w:ascii="Avenir Next" w:hAnsi="Avenir Next" w:cs="Avenir Next" w:eastAsia="Avenir Next"/>
                 <w:b/>
                 <w:color w:val="1A1A1A"/>
-                <w:sz w:val="17"/>
+                <w:sz w:val="22"/>
                 <w:szCs w:val="17"/>
               </w:rPr>
               <w:t xml:space="preserve">6.</w:t>
@@ -1326,7 +1331,7 @@
               <w:rPr>
                 <w:rFonts w:ascii="Avenir Next" w:hAnsi="Avenir Next" w:cs="Avenir Next" w:eastAsia="Avenir Next"/>
                 <w:color w:val="1A1A1A"/>
-                <w:sz w:val="17"/>
+                <w:sz w:val="22"/>
                 <w:szCs w:val="17"/>
               </w:rPr>
               <w:t xml:space="preserve">a. 4  b. 2  c. 2  d. 1  e. 1  f. 10</w:t>
@@ -1345,7 +1350,7 @@
                 <w:rFonts w:ascii="Avenir Next" w:hAnsi="Avenir Next" w:cs="Avenir Next" w:eastAsia="Avenir Next"/>
                 <w:b/>
                 <w:color w:val="1A1A1A"/>
-                <w:sz w:val="17"/>
+                <w:sz w:val="22"/>
                 <w:szCs w:val="17"/>
               </w:rPr>
               <w:t xml:space="preserve">7.</w:t>
@@ -1364,7 +1369,7 @@
                 <w:rFonts w:ascii="Avenir Next" w:hAnsi="Avenir Next" w:cs="Avenir Next" w:eastAsia="Avenir Next"/>
                 <w:b/>
                 <w:color w:val="1A1A1A"/>
-                <w:sz w:val="17"/>
+                <w:sz w:val="22"/>
                 <w:szCs w:val="17"/>
               </w:rPr>
               <w:t xml:space="preserve">C</w:t>
@@ -1373,7 +1378,7 @@
               <w:rPr>
                 <w:rFonts w:ascii="Avenir Next" w:hAnsi="Avenir Next" w:cs="Avenir Next" w:eastAsia="Avenir Next"/>
                 <w:color w:val="1A1A1A"/>
-                <w:sz w:val="17"/>
+                <w:sz w:val="22"/>
                 <w:szCs w:val="17"/>
               </w:rPr>
               <w:t xml:space="preserve">  (12)</w:t>
@@ -1470,7 +1475,106 @@
               <w:sz w:val="15"/>
               <w:szCs w:val="15"/>
             </w:rPr>
-            <w:t xml:space="preserve">Lesson 2-1  ·  Prerequisite Practice  ·  Answer Key</w:t>
+            <w:t xml:space="preserve">2-1 · Page </w:t>
+          </w:r>
+          <w:r>
+            <w:rPr>
+              <w:rFonts w:ascii="Avenir Next" w:hAnsi="Avenir Next" w:cs="Avenir Next" w:eastAsia="Avenir Next"/>
+              <w:color w:val="5A5F66"/>
+              <w:sz w:val="15"/>
+              <w:szCs w:val="15"/>
+            </w:rPr>
+            <w:fldChar w:fldCharType="begin"/>
+          </w:r>
+          <w:r>
+            <w:rPr>
+              <w:rFonts w:ascii="Avenir Next" w:hAnsi="Avenir Next" w:cs="Avenir Next" w:eastAsia="Avenir Next"/>
+              <w:color w:val="5A5F66"/>
+              <w:sz w:val="15"/>
+              <w:szCs w:val="15"/>
+            </w:rPr>
+            <w:instrText xml:space="preserve"> PAGE </w:instrText>
+          </w:r>
+          <w:r>
+            <w:rPr>
+              <w:rFonts w:ascii="Avenir Next" w:hAnsi="Avenir Next" w:cs="Avenir Next" w:eastAsia="Avenir Next"/>
+              <w:color w:val="5A5F66"/>
+              <w:sz w:val="15"/>
+              <w:szCs w:val="15"/>
+            </w:rPr>
+            <w:fldChar w:fldCharType="separate"/>
+          </w:r>
+          <w:r>
+            <w:rPr>
+              <w:rFonts w:ascii="Avenir Next" w:hAnsi="Avenir Next" w:cs="Avenir Next" w:eastAsia="Avenir Next"/>
+              <w:color w:val="5A5F66"/>
+              <w:sz w:val="15"/>
+              <w:szCs w:val="15"/>
+            </w:rPr>
+            <w:t xml:space="preserve">1</w:t>
+          </w:r>
+          <w:r>
+            <w:rPr>
+              <w:rFonts w:ascii="Avenir Next" w:hAnsi="Avenir Next" w:cs="Avenir Next" w:eastAsia="Avenir Next"/>
+              <w:color w:val="5A5F66"/>
+              <w:sz w:val="15"/>
+              <w:szCs w:val="15"/>
+            </w:rPr>
+            <w:fldChar w:fldCharType="end"/>
+          </w:r>
+          <w:r>
+            <w:rPr>
+              <w:rFonts w:ascii="Avenir Next" w:hAnsi="Avenir Next" w:cs="Avenir Next" w:eastAsia="Avenir Next"/>
+              <w:color w:val="5A5F66"/>
+              <w:sz w:val="15"/>
+              <w:szCs w:val="15"/>
+            </w:rPr>
+            <w:t xml:space="preserve"> of </w:t>
+          </w:r>
+          <w:r>
+            <w:rPr>
+              <w:rFonts w:ascii="Avenir Next" w:hAnsi="Avenir Next" w:cs="Avenir Next" w:eastAsia="Avenir Next"/>
+              <w:color w:val="5A5F66"/>
+              <w:sz w:val="15"/>
+              <w:szCs w:val="15"/>
+            </w:rPr>
+            <w:fldChar w:fldCharType="begin"/>
+          </w:r>
+          <w:r>
+            <w:rPr>
+              <w:rFonts w:ascii="Avenir Next" w:hAnsi="Avenir Next" w:cs="Avenir Next" w:eastAsia="Avenir Next"/>
+              <w:color w:val="5A5F66"/>
+              <w:sz w:val="15"/>
+              <w:szCs w:val="15"/>
+            </w:rPr>
+            <w:instrText xml:space="preserve"> NUMPAGES </w:instrText>
+          </w:r>
+          <w:r>
+            <w:rPr>
+              <w:rFonts w:ascii="Avenir Next" w:hAnsi="Avenir Next" w:cs="Avenir Next" w:eastAsia="Avenir Next"/>
+              <w:color w:val="5A5F66"/>
+              <w:sz w:val="15"/>
+              <w:szCs w:val="15"/>
+            </w:rPr>
+            <w:fldChar w:fldCharType="separate"/>
+          </w:r>
+          <w:r>
+            <w:rPr>
+              <w:rFonts w:ascii="Avenir Next" w:hAnsi="Avenir Next" w:cs="Avenir Next" w:eastAsia="Avenir Next"/>
+              <w:color w:val="5A5F66"/>
+              <w:sz w:val="15"/>
+              <w:szCs w:val="15"/>
+            </w:rPr>
+            <w:t xml:space="preserve">1</w:t>
+          </w:r>
+          <w:r>
+            <w:rPr>
+              <w:rFonts w:ascii="Avenir Next" w:hAnsi="Avenir Next" w:cs="Avenir Next" w:eastAsia="Avenir Next"/>
+              <w:color w:val="5A5F66"/>
+              <w:sz w:val="15"/>
+              <w:szCs w:val="15"/>
+            </w:rPr>
+            <w:fldChar w:fldCharType="end"/>
           </w:r>
         </w:p>
       </w:tc>
@@ -1513,5 +1617,23 @@
       </w:tblCellMar>
     </w:tblPr>
   </w:style>
+  <w:style w:type="paragraph" w:styleId="Heading1">
+    <w:name w:val="heading 1"/>
+    <w:basedOn w:val="Normal"/>
+    <w:pPr>
+      <w:outlineLvl w:val="0"/>
+      <w:keepNext w:val="0"/>
+      <w:keepLines w:val="0"/>
+    </w:pPr>
+  </w:style>
+  <w:style w:type="paragraph" w:styleId="Heading2">
+    <w:name w:val="heading 2"/>
+    <w:basedOn w:val="Normal"/>
+    <w:pPr>
+      <w:outlineLvl w:val="1"/>
+      <w:keepNext w:val="0"/>
+      <w:keepLines w:val="0"/>
+    </w:pPr>
+  </w:style>
 </w:styles>
 </file>
</xml_diff>